<commit_message>
Restyle Homelab_Local_GitHub_Mirror_and_Storage.docx to combined Word style
Regenerated with the combined style (2026-10-03 darker text on blue shading) and added the required header caption and footer with right-aligned page numbers.
</commit_message>
<xml_diff>
--- a/docs/Homelab_Local_GitHub_Mirror_and_Storage.docx
+++ b/docs/Homelab_Local_GitHub_Mirror_and_Storage.docx
@@ -4,26 +4,33 @@
   <w:body>
     <w:p>
       <w:pPr>
-        <w:jc w:val="left"/>
+        <w:pStyle w:val="Title"/>
       </w:pPr>
       <w:r>
-        <w:rPr>
-          <w:b/>
-          <w:sz w:val="40"/>
-        </w:rPr>
         <w:t>Homelab Local GitHub Mirror and Storage Runbook</w:t>
       </w:r>
     </w:p>
     <w:p>
+      <w:pPr>
+        <w:pStyle w:val="Subtitle"/>
+      </w:pPr>
       <w:r>
-        <w:rPr>
-          <w:i/>
-        </w:rPr>
         <w:t>Homelab cluster skynet · jameshomelab.org · Forgejo pull-mirror plan · NAS vs SMB · 32TB_SSD</w:t>
       </w:r>
     </w:p>
     <w:p>
+      <w:pPr>
+        <w:shd w:val="clear" w:color="auto" w:fill="F0F4F7"/>
+        <w:pBdr>
+          <w:left w:val="single" w:sz="24" w:space="6" w:color="4F81BD"/>
+        </w:pBdr>
+        <w:spacing w:after="200"/>
+      </w:pPr>
       <w:r>
+        <w:rPr>
+          <w:color w:val="333333"/>
+          <w:sz w:val="20"/>
+        </w:rPr>
         <w:t>Status: architecture decided 2026-09-12 · 32TB SMB CSI live · Forgejo Flux not deployed yet</w:t>
       </w:r>
     </w:p>
@@ -134,10 +141,17 @@
       </w:r>
     </w:p>
     <w:p>
+      <w:pPr>
+        <w:keepLines/>
+        <w:spacing w:line="240" w:lineRule="auto" w:before="40" w:after="180"/>
+        <w:ind w:left="86" w:right="86"/>
+        <w:shd w:val="clear" w:color="auto" w:fill="F0F4F7"/>
+      </w:pPr>
       <w:r>
         <w:rPr>
-          <w:rFonts w:ascii="Consolas" w:hAnsi="Consolas"/>
-          <w:sz w:val="18"/>
+          <w:rFonts w:ascii="Consolas" w:hAnsi="Consolas" w:eastAsia="Consolas"/>
+          <w:color w:val="000000"/>
+          <w:sz w:val="19"/>
         </w:rPr>
         <w:t>GitHub (source of truth for public/collaboration)</w:t>
         <w:br/>
@@ -340,23 +354,48 @@
     </w:p>
     <w:tbl>
       <w:tblPr>
-        <w:tblStyle w:val="TableGrid"/>
+        <w:tblStyle w:val="LightShading-Accent1"/>
         <w:tblW w:type="auto" w:w="0"/>
+        <w:tblLayout w:type="fixed"/>
         <w:tblLook w:firstColumn="1" w:firstRow="1" w:lastColumn="0" w:lastRow="0" w:noHBand="0" w:noVBand="1" w:val="04A0"/>
+        <w:tblBorders>
+          <w:top w:val="single" w:sz="8" w:space="0" w:color="4F81BD"/>
+          <w:left w:val="nil"/>
+          <w:bottom w:val="single" w:sz="8" w:space="0" w:color="4F81BD"/>
+          <w:right w:val="nil"/>
+          <w:insideH w:val="nil"/>
+          <w:insideV w:val="nil"/>
+        </w:tblBorders>
       </w:tblPr>
       <w:tblGrid>
-        <w:gridCol w:w="4320"/>
-        <w:gridCol w:w="4320"/>
+        <w:gridCol w:w="5040"/>
+        <w:gridCol w:w="5040"/>
       </w:tblGrid>
       <w:tr>
+        <w:trPr>
+          <w:cantSplit/>
+          <w:tblHeader w:val="true"/>
+        </w:trPr>
         <w:tc>
           <w:tcPr>
-            <w:tcW w:type="dxa" w:w="4320"/>
+            <w:tcW w:type="dxa" w:w="5040"/>
+            <w:tcBorders>
+              <w:top w:val="single" w:sz="8" w:space="0" w:color="4F81BD"/>
+              <w:bottom w:val="single" w:sz="8" w:space="0" w:color="4F81BD"/>
+            </w:tcBorders>
+            <w:shd w:val="clear" w:color="auto" w:fill="365F91"/>
           </w:tcPr>
           <w:p>
+            <w:pPr>
+              <w:keepNext/>
+              <w:spacing w:before="40" w:after="40" w:line="240" w:lineRule="auto"/>
+            </w:pPr>
+            <w:r/>
             <w:r>
               <w:rPr>
                 <w:b/>
+                <w:color w:val="FFFFFF"/>
+                <w:sz w:val="20"/>
               </w:rPr>
               <w:t>Item</w:t>
             </w:r>
@@ -364,12 +403,24 @@
         </w:tc>
         <w:tc>
           <w:tcPr>
-            <w:tcW w:type="dxa" w:w="4320"/>
+            <w:tcW w:type="dxa" w:w="5040"/>
+            <w:tcBorders>
+              <w:top w:val="single" w:sz="8" w:space="0" w:color="4F81BD"/>
+              <w:bottom w:val="single" w:sz="8" w:space="0" w:color="4F81BD"/>
+            </w:tcBorders>
+            <w:shd w:val="clear" w:color="auto" w:fill="365F91"/>
           </w:tcPr>
           <w:p>
+            <w:pPr>
+              <w:keepNext/>
+              <w:spacing w:before="40" w:after="40" w:line="240" w:lineRule="auto"/>
+            </w:pPr>
+            <w:r/>
             <w:r>
               <w:rPr>
                 <w:b/>
+                <w:color w:val="FFFFFF"/>
+                <w:sz w:val="20"/>
               </w:rPr>
               <w:t>Value</w:t>
             </w:r>
@@ -377,183 +428,363 @@
         </w:tc>
       </w:tr>
       <w:tr>
+        <w:trPr>
+          <w:cantSplit/>
+        </w:trPr>
         <w:tc>
           <w:tcPr>
-            <w:tcW w:type="dxa" w:w="4320"/>
+            <w:tcW w:type="dxa" w:w="5040"/>
+            <w:shd w:val="clear" w:color="auto" w:fill="D3DFEE"/>
           </w:tcPr>
           <w:p>
+            <w:pPr>
+              <w:spacing w:before="40" w:after="40" w:line="240" w:lineRule="auto"/>
+            </w:pPr>
+            <w:r/>
             <w:r>
+              <w:rPr>
+                <w:b/>
+                <w:color w:val="173A53"/>
+                <w:sz w:val="20"/>
+              </w:rPr>
               <w:t>Appliance</w:t>
             </w:r>
           </w:p>
         </w:tc>
         <w:tc>
           <w:tcPr>
-            <w:tcW w:type="dxa" w:w="4320"/>
+            <w:tcW w:type="dxa" w:w="5040"/>
+            <w:shd w:val="clear" w:color="auto" w:fill="D3DFEE"/>
           </w:tcPr>
           <w:p>
+            <w:pPr>
+              <w:spacing w:before="40" w:after="40" w:line="240" w:lineRule="auto"/>
+            </w:pPr>
+            <w:r/>
             <w:r>
+              <w:rPr>
+                <w:color w:val="1A1A1A"/>
+                <w:sz w:val="20"/>
+              </w:rPr>
               <w:t>192.168.71.249, share G (guest)</w:t>
             </w:r>
           </w:p>
         </w:tc>
       </w:tr>
       <w:tr>
+        <w:trPr>
+          <w:cantSplit/>
+        </w:trPr>
         <w:tc>
           <w:tcPr>
-            <w:tcW w:type="dxa" w:w="4320"/>
+            <w:tcW w:type="dxa" w:w="5040"/>
+            <w:shd w:val="clear" w:color="auto" w:fill="FFFFFF"/>
           </w:tcPr>
           <w:p>
+            <w:pPr>
+              <w:spacing w:before="40" w:after="40" w:line="240" w:lineRule="auto"/>
+            </w:pPr>
+            <w:r/>
             <w:r>
+              <w:rPr>
+                <w:b/>
+                <w:color w:val="173A53"/>
+                <w:sz w:val="20"/>
+              </w:rPr>
               <w:t>Mini mount</w:t>
             </w:r>
           </w:p>
         </w:tc>
         <w:tc>
           <w:tcPr>
-            <w:tcW w:type="dxa" w:w="4320"/>
+            <w:tcW w:type="dxa" w:w="5040"/>
+            <w:shd w:val="clear" w:color="auto" w:fill="FFFFFF"/>
           </w:tcPr>
           <w:p>
+            <w:pPr>
+              <w:spacing w:before="40" w:after="40" w:line="240" w:lineRule="auto"/>
+            </w:pPr>
+            <w:r/>
             <w:r>
+              <w:rPr>
+                <w:color w:val="1A1A1A"/>
+                <w:sz w:val="20"/>
+              </w:rPr>
               <w:t>/Volumes/32TB_SSD (also File Sharing name 32TB_SSD)</w:t>
             </w:r>
           </w:p>
         </w:tc>
       </w:tr>
       <w:tr>
+        <w:trPr>
+          <w:cantSplit/>
+        </w:trPr>
         <w:tc>
           <w:tcPr>
-            <w:tcW w:type="dxa" w:w="4320"/>
+            <w:tcW w:type="dxa" w:w="5040"/>
+            <w:shd w:val="clear" w:color="auto" w:fill="D3DFEE"/>
           </w:tcPr>
           <w:p>
+            <w:pPr>
+              <w:spacing w:before="40" w:after="40" w:line="240" w:lineRule="auto"/>
+            </w:pPr>
+            <w:r/>
             <w:r>
+              <w:rPr>
+                <w:b/>
+                <w:color w:val="173A53"/>
+                <w:sz w:val="20"/>
+              </w:rPr>
               <w:t>Scratch folder</w:t>
             </w:r>
           </w:p>
         </w:tc>
         <w:tc>
           <w:tcPr>
-            <w:tcW w:type="dxa" w:w="4320"/>
+            <w:tcW w:type="dxa" w:w="5040"/>
+            <w:shd w:val="clear" w:color="auto" w:fill="D3DFEE"/>
           </w:tcPr>
           <w:p>
+            <w:pPr>
+              <w:spacing w:before="40" w:after="40" w:line="240" w:lineRule="auto"/>
+            </w:pPr>
+            <w:r/>
             <w:r>
+              <w:rPr>
+                <w:color w:val="1A1A1A"/>
+                <w:sz w:val="20"/>
+              </w:rPr>
               <w:t>DevStorage/</w:t>
             </w:r>
           </w:p>
         </w:tc>
       </w:tr>
       <w:tr>
+        <w:trPr>
+          <w:cantSplit/>
+        </w:trPr>
         <w:tc>
           <w:tcPr>
-            <w:tcW w:type="dxa" w:w="4320"/>
+            <w:tcW w:type="dxa" w:w="5040"/>
+            <w:shd w:val="clear" w:color="auto" w:fill="FFFFFF"/>
           </w:tcPr>
           <w:p>
+            <w:pPr>
+              <w:spacing w:before="40" w:after="40" w:line="240" w:lineRule="auto"/>
+            </w:pPr>
+            <w:r/>
             <w:r>
+              <w:rPr>
+                <w:b/>
+                <w:color w:val="173A53"/>
+                <w:sz w:val="20"/>
+              </w:rPr>
               <w:t>SC smb-32tb</w:t>
             </w:r>
           </w:p>
         </w:tc>
         <w:tc>
           <w:tcPr>
-            <w:tcW w:type="dxa" w:w="4320"/>
+            <w:tcW w:type="dxa" w:w="5040"/>
+            <w:shd w:val="clear" w:color="auto" w:fill="FFFFFF"/>
           </w:tcPr>
           <w:p>
+            <w:pPr>
+              <w:spacing w:before="40" w:after="40" w:line="240" w:lineRule="auto"/>
+            </w:pPr>
+            <w:r/>
             <w:r>
+              <w:rPr>
+                <w:color w:val="1A1A1A"/>
+                <w:sz w:val="20"/>
+              </w:rPr>
               <w:t>//192.168.71.249/G</w:t>
             </w:r>
           </w:p>
         </w:tc>
       </w:tr>
       <w:tr>
+        <w:trPr>
+          <w:cantSplit/>
+        </w:trPr>
         <w:tc>
           <w:tcPr>
-            <w:tcW w:type="dxa" w:w="4320"/>
+            <w:tcW w:type="dxa" w:w="5040"/>
+            <w:shd w:val="clear" w:color="auto" w:fill="D3DFEE"/>
           </w:tcPr>
           <w:p>
+            <w:pPr>
+              <w:spacing w:before="40" w:after="40" w:line="240" w:lineRule="auto"/>
+            </w:pPr>
+            <w:r/>
             <w:r>
+              <w:rPr>
+                <w:b/>
+                <w:color w:val="173A53"/>
+                <w:sz w:val="20"/>
+              </w:rPr>
               <w:t>SC smb-32tb-devstorage</w:t>
             </w:r>
           </w:p>
         </w:tc>
         <w:tc>
           <w:tcPr>
-            <w:tcW w:type="dxa" w:w="4320"/>
+            <w:tcW w:type="dxa" w:w="5040"/>
+            <w:shd w:val="clear" w:color="auto" w:fill="D3DFEE"/>
           </w:tcPr>
           <w:p>
+            <w:pPr>
+              <w:spacing w:before="40" w:after="40" w:line="240" w:lineRule="auto"/>
+            </w:pPr>
+            <w:r/>
             <w:r>
+              <w:rPr>
+                <w:color w:val="1A1A1A"/>
+                <w:sz w:val="20"/>
+              </w:rPr>
               <w:t>//192.168.71.249/G/DevStorage</w:t>
             </w:r>
           </w:p>
         </w:tc>
       </w:tr>
       <w:tr>
+        <w:trPr>
+          <w:cantSplit/>
+        </w:trPr>
         <w:tc>
           <w:tcPr>
-            <w:tcW w:type="dxa" w:w="4320"/>
+            <w:tcW w:type="dxa" w:w="5040"/>
+            <w:shd w:val="clear" w:color="auto" w:fill="FFFFFF"/>
           </w:tcPr>
           <w:p>
+            <w:pPr>
+              <w:spacing w:before="40" w:after="40" w:line="240" w:lineRule="auto"/>
+            </w:pPr>
+            <w:r/>
             <w:r>
+              <w:rPr>
+                <w:b/>
+                <w:color w:val="173A53"/>
+                <w:sz w:val="20"/>
+              </w:rPr>
               <w:t>Secret</w:t>
             </w:r>
           </w:p>
         </w:tc>
         <w:tc>
           <w:tcPr>
-            <w:tcW w:type="dxa" w:w="4320"/>
+            <w:tcW w:type="dxa" w:w="5040"/>
+            <w:shd w:val="clear" w:color="auto" w:fill="FFFFFF"/>
           </w:tcPr>
           <w:p>
+            <w:pPr>
+              <w:spacing w:before="40" w:after="40" w:line="240" w:lineRule="auto"/>
+            </w:pPr>
+            <w:r/>
             <w:r>
+              <w:rPr>
+                <w:color w:val="1A1A1A"/>
+                <w:sz w:val="20"/>
+              </w:rPr>
               <w:t>smb-32tb-credentials in ns devpod (SOPS)</w:t>
             </w:r>
           </w:p>
         </w:tc>
       </w:tr>
       <w:tr>
+        <w:trPr>
+          <w:cantSplit/>
+        </w:trPr>
         <w:tc>
           <w:tcPr>
-            <w:tcW w:type="dxa" w:w="4320"/>
+            <w:tcW w:type="dxa" w:w="5040"/>
+            <w:shd w:val="clear" w:color="auto" w:fill="D3DFEE"/>
           </w:tcPr>
           <w:p>
+            <w:pPr>
+              <w:spacing w:before="40" w:after="40" w:line="240" w:lineRule="auto"/>
+            </w:pPr>
+            <w:r/>
             <w:r>
+              <w:rPr>
+                <w:b/>
+                <w:color w:val="173A53"/>
+                <w:sz w:val="20"/>
+              </w:rPr>
               <w:t>Standing PVC</w:t>
             </w:r>
           </w:p>
         </w:tc>
         <w:tc>
           <w:tcPr>
-            <w:tcW w:type="dxa" w:w="4320"/>
+            <w:tcW w:type="dxa" w:w="5040"/>
+            <w:shd w:val="clear" w:color="auto" w:fill="D3DFEE"/>
           </w:tcPr>
           <w:p>
+            <w:pPr>
+              <w:spacing w:before="40" w:after="40" w:line="240" w:lineRule="auto"/>
+            </w:pPr>
+            <w:r/>
             <w:r>
+              <w:rPr>
+                <w:color w:val="1A1A1A"/>
+                <w:sz w:val="20"/>
+              </w:rPr>
               <w:t>devpod/devpod-scratch 500Gi RWX Bound</w:t>
             </w:r>
           </w:p>
         </w:tc>
       </w:tr>
       <w:tr>
+        <w:trPr>
+          <w:cantSplit/>
+        </w:trPr>
         <w:tc>
           <w:tcPr>
-            <w:tcW w:type="dxa" w:w="4320"/>
+            <w:tcW w:type="dxa" w:w="5040"/>
+            <w:shd w:val="clear" w:color="auto" w:fill="FFFFFF"/>
           </w:tcPr>
           <w:p>
+            <w:pPr>
+              <w:spacing w:before="40" w:after="40" w:line="240" w:lineRule="auto"/>
+            </w:pPr>
+            <w:r/>
             <w:r>
+              <w:rPr>
+                <w:b/>
+                <w:color w:val="173A53"/>
+                <w:sz w:val="20"/>
+              </w:rPr>
               <w:t>DevPod mount</w:t>
             </w:r>
           </w:p>
         </w:tc>
         <w:tc>
           <w:tcPr>
-            <w:tcW w:type="dxa" w:w="4320"/>
+            <w:tcW w:type="dxa" w:w="5040"/>
+            <w:shd w:val="clear" w:color="auto" w:fill="FFFFFF"/>
           </w:tcPr>
           <w:p>
+            <w:pPr>
+              <w:spacing w:before="40" w:after="40" w:line="240" w:lineRule="auto"/>
+            </w:pPr>
+            <w:r/>
             <w:r>
+              <w:rPr>
+                <w:color w:val="1A1A1A"/>
+                <w:sz w:val="20"/>
+              </w:rPr>
               <w:t>/scratch via skynet-pod-template.yaml</w:t>
             </w:r>
           </w:p>
         </w:tc>
       </w:tr>
     </w:tbl>
-    <w:p/>
+    <w:p>
+      <w:pPr>
+        <w:spacing w:after="40" w:line="120" w:lineRule="exact"/>
+      </w:pPr>
+    </w:p>
     <w:p>
       <w:r>
         <w:t>CSI talks to the appliance directly (not via the mini SMB re-export) for cluster PVCs.</w:t>
@@ -569,24 +800,49 @@
     </w:p>
     <w:tbl>
       <w:tblPr>
-        <w:tblStyle w:val="TableGrid"/>
+        <w:tblStyle w:val="LightShading-Accent1"/>
         <w:tblW w:type="auto" w:w="0"/>
+        <w:tblLayout w:type="fixed"/>
         <w:tblLook w:firstColumn="1" w:firstRow="1" w:lastColumn="0" w:lastRow="0" w:noHBand="0" w:noVBand="1" w:val="04A0"/>
+        <w:tblBorders>
+          <w:top w:val="single" w:sz="8" w:space="0" w:color="4F81BD"/>
+          <w:left w:val="nil"/>
+          <w:bottom w:val="single" w:sz="8" w:space="0" w:color="4F81BD"/>
+          <w:right w:val="nil"/>
+          <w:insideH w:val="nil"/>
+          <w:insideV w:val="nil"/>
+        </w:tblBorders>
       </w:tblPr>
       <w:tblGrid>
-        <w:gridCol w:w="2880"/>
-        <w:gridCol w:w="2880"/>
-        <w:gridCol w:w="2880"/>
+        <w:gridCol w:w="3360"/>
+        <w:gridCol w:w="3360"/>
+        <w:gridCol w:w="3360"/>
       </w:tblGrid>
       <w:tr>
+        <w:trPr>
+          <w:cantSplit/>
+          <w:tblHeader w:val="true"/>
+        </w:trPr>
         <w:tc>
           <w:tcPr>
-            <w:tcW w:type="dxa" w:w="2880"/>
+            <w:tcW w:type="dxa" w:w="3360"/>
+            <w:tcBorders>
+              <w:top w:val="single" w:sz="8" w:space="0" w:color="4F81BD"/>
+              <w:bottom w:val="single" w:sz="8" w:space="0" w:color="4F81BD"/>
+            </w:tcBorders>
+            <w:shd w:val="clear" w:color="auto" w:fill="365F91"/>
           </w:tcPr>
           <w:p>
+            <w:pPr>
+              <w:keepNext/>
+              <w:spacing w:before="40" w:after="40" w:line="240" w:lineRule="auto"/>
+            </w:pPr>
+            <w:r/>
             <w:r>
               <w:rPr>
                 <w:b/>
+                <w:color w:val="FFFFFF"/>
+                <w:sz w:val="20"/>
               </w:rPr>
               <w:t>Workload</w:t>
             </w:r>
@@ -594,12 +850,24 @@
         </w:tc>
         <w:tc>
           <w:tcPr>
-            <w:tcW w:type="dxa" w:w="2880"/>
+            <w:tcW w:type="dxa" w:w="3360"/>
+            <w:tcBorders>
+              <w:top w:val="single" w:sz="8" w:space="0" w:color="4F81BD"/>
+              <w:bottom w:val="single" w:sz="8" w:space="0" w:color="4F81BD"/>
+            </w:tcBorders>
+            <w:shd w:val="clear" w:color="auto" w:fill="365F91"/>
           </w:tcPr>
           <w:p>
+            <w:pPr>
+              <w:keepNext/>
+              <w:spacing w:before="40" w:after="40" w:line="240" w:lineRule="auto"/>
+            </w:pPr>
+            <w:r/>
             <w:r>
               <w:rPr>
                 <w:b/>
+                <w:color w:val="FFFFFF"/>
+                <w:sz w:val="20"/>
               </w:rPr>
               <w:t>Prefer</w:t>
             </w:r>
@@ -607,12 +875,24 @@
         </w:tc>
         <w:tc>
           <w:tcPr>
-            <w:tcW w:type="dxa" w:w="2880"/>
+            <w:tcW w:type="dxa" w:w="3360"/>
+            <w:tcBorders>
+              <w:top w:val="single" w:sz="8" w:space="0" w:color="4F81BD"/>
+              <w:bottom w:val="single" w:sz="8" w:space="0" w:color="4F81BD"/>
+            </w:tcBorders>
+            <w:shd w:val="clear" w:color="auto" w:fill="365F91"/>
           </w:tcPr>
           <w:p>
+            <w:pPr>
+              <w:keepNext/>
+              <w:spacing w:before="40" w:after="40" w:line="240" w:lineRule="auto"/>
+            </w:pPr>
+            <w:r/>
             <w:r>
               <w:rPr>
                 <w:b/>
+                <w:color w:val="FFFFFF"/>
+                <w:sz w:val="20"/>
               </w:rPr>
               <w:t>Avoid</w:t>
             </w:r>
@@ -620,199 +900,389 @@
         </w:tc>
       </w:tr>
       <w:tr>
+        <w:trPr>
+          <w:cantSplit/>
+        </w:trPr>
         <w:tc>
           <w:tcPr>
-            <w:tcW w:type="dxa" w:w="2880"/>
+            <w:tcW w:type="dxa" w:w="3360"/>
+            <w:shd w:val="clear" w:color="auto" w:fill="D3DFEE"/>
           </w:tcPr>
           <w:p>
+            <w:pPr>
+              <w:spacing w:before="40" w:after="40" w:line="240" w:lineRule="auto"/>
+            </w:pPr>
+            <w:r/>
             <w:r>
+              <w:rPr>
+                <w:b/>
+                <w:color w:val="173A53"/>
+                <w:sz w:val="20"/>
+              </w:rPr>
               <w:t>Postgres / CNPG</w:t>
             </w:r>
           </w:p>
         </w:tc>
         <w:tc>
           <w:tcPr>
-            <w:tcW w:type="dxa" w:w="2880"/>
+            <w:tcW w:type="dxa" w:w="3360"/>
+            <w:shd w:val="clear" w:color="auto" w:fill="D3DFEE"/>
           </w:tcPr>
           <w:p>
+            <w:pPr>
+              <w:spacing w:before="40" w:after="40" w:line="240" w:lineRule="auto"/>
+            </w:pPr>
+            <w:r/>
             <w:r>
+              <w:rPr>
+                <w:color w:val="1A1A1A"/>
+                <w:sz w:val="20"/>
+              </w:rPr>
               <w:t>Longhorn / local NVMe policy</w:t>
             </w:r>
           </w:p>
         </w:tc>
         <w:tc>
           <w:tcPr>
-            <w:tcW w:type="dxa" w:w="2880"/>
+            <w:tcW w:type="dxa" w:w="3360"/>
+            <w:shd w:val="clear" w:color="auto" w:fill="D3DFEE"/>
           </w:tcPr>
           <w:p>
+            <w:pPr>
+              <w:spacing w:before="40" w:after="40" w:line="240" w:lineRule="auto"/>
+            </w:pPr>
+            <w:r/>
             <w:r>
+              <w:rPr>
+                <w:color w:val="1A1A1A"/>
+                <w:sz w:val="20"/>
+              </w:rPr>
               <w:t>SMB</w:t>
             </w:r>
           </w:p>
         </w:tc>
       </w:tr>
       <w:tr>
+        <w:trPr>
+          <w:cantSplit/>
+        </w:trPr>
         <w:tc>
           <w:tcPr>
-            <w:tcW w:type="dxa" w:w="2880"/>
+            <w:tcW w:type="dxa" w:w="3360"/>
+            <w:shd w:val="clear" w:color="auto" w:fill="FFFFFF"/>
           </w:tcPr>
           <w:p>
+            <w:pPr>
+              <w:spacing w:before="40" w:after="40" w:line="240" w:lineRule="auto"/>
+            </w:pPr>
+            <w:r/>
             <w:r>
+              <w:rPr>
+                <w:b/>
+                <w:color w:val="173A53"/>
+                <w:sz w:val="20"/>
+              </w:rPr>
               <w:t>Forgejo git + DB</w:t>
             </w:r>
           </w:p>
         </w:tc>
         <w:tc>
           <w:tcPr>
-            <w:tcW w:type="dxa" w:w="2880"/>
+            <w:tcW w:type="dxa" w:w="3360"/>
+            <w:shd w:val="clear" w:color="auto" w:fill="FFFFFF"/>
           </w:tcPr>
           <w:p>
+            <w:pPr>
+              <w:spacing w:before="40" w:after="40" w:line="240" w:lineRule="auto"/>
+            </w:pPr>
+            <w:r/>
             <w:r>
+              <w:rPr>
+                <w:color w:val="1A1A1A"/>
+                <w:sz w:val="20"/>
+              </w:rPr>
               <w:t>Longhorn</w:t>
             </w:r>
           </w:p>
         </w:tc>
         <w:tc>
           <w:tcPr>
-            <w:tcW w:type="dxa" w:w="2880"/>
+            <w:tcW w:type="dxa" w:w="3360"/>
+            <w:shd w:val="clear" w:color="auto" w:fill="FFFFFF"/>
           </w:tcPr>
           <w:p>
+            <w:pPr>
+              <w:spacing w:before="40" w:after="40" w:line="240" w:lineRule="auto"/>
+            </w:pPr>
+            <w:r/>
             <w:r>
+              <w:rPr>
+                <w:color w:val="1A1A1A"/>
+                <w:sz w:val="20"/>
+              </w:rPr>
               <w:t>SMB / 32TB</w:t>
             </w:r>
           </w:p>
         </w:tc>
       </w:tr>
       <w:tr>
+        <w:trPr>
+          <w:cantSplit/>
+        </w:trPr>
         <w:tc>
           <w:tcPr>
-            <w:tcW w:type="dxa" w:w="2880"/>
+            <w:tcW w:type="dxa" w:w="3360"/>
+            <w:shd w:val="clear" w:color="auto" w:fill="D3DFEE"/>
           </w:tcPr>
           <w:p>
+            <w:pPr>
+              <w:spacing w:before="40" w:after="40" w:line="240" w:lineRule="auto"/>
+            </w:pPr>
+            <w:r/>
             <w:r>
+              <w:rPr>
+                <w:b/>
+                <w:color w:val="173A53"/>
+                <w:sz w:val="20"/>
+              </w:rPr>
               <w:t>DevPod workspace PVC</w:t>
             </w:r>
           </w:p>
         </w:tc>
         <w:tc>
           <w:tcPr>
-            <w:tcW w:type="dxa" w:w="2880"/>
+            <w:tcW w:type="dxa" w:w="3360"/>
+            <w:shd w:val="clear" w:color="auto" w:fill="D3DFEE"/>
           </w:tcPr>
           <w:p>
+            <w:pPr>
+              <w:spacing w:before="40" w:after="40" w:line="240" w:lineRule="auto"/>
+            </w:pPr>
+            <w:r/>
             <w:r>
+              <w:rPr>
+                <w:color w:val="1A1A1A"/>
+                <w:sz w:val="20"/>
+              </w:rPr>
               <w:t>Longhorn RWO</w:t>
             </w:r>
           </w:p>
         </w:tc>
         <w:tc>
           <w:tcPr>
-            <w:tcW w:type="dxa" w:w="2880"/>
+            <w:tcW w:type="dxa" w:w="3360"/>
+            <w:shd w:val="clear" w:color="auto" w:fill="D3DFEE"/>
           </w:tcPr>
           <w:p>
+            <w:pPr>
+              <w:spacing w:before="40" w:after="40" w:line="240" w:lineRule="auto"/>
+            </w:pPr>
+            <w:r/>
             <w:r>
+              <w:rPr>
+                <w:color w:val="1A1A1A"/>
+                <w:sz w:val="20"/>
+              </w:rPr>
               <w:t>SMB</w:t>
             </w:r>
           </w:p>
         </w:tc>
       </w:tr>
       <w:tr>
+        <w:trPr>
+          <w:cantSplit/>
+        </w:trPr>
         <w:tc>
           <w:tcPr>
-            <w:tcW w:type="dxa" w:w="2880"/>
+            <w:tcW w:type="dxa" w:w="3360"/>
+            <w:shd w:val="clear" w:color="auto" w:fill="FFFFFF"/>
           </w:tcPr>
           <w:p>
+            <w:pPr>
+              <w:spacing w:before="40" w:after="40" w:line="240" w:lineRule="auto"/>
+            </w:pPr>
+            <w:r/>
             <w:r>
+              <w:rPr>
+                <w:b/>
+                <w:color w:val="173A53"/>
+                <w:sz w:val="20"/>
+              </w:rPr>
               <w:t>DevPod scratch</w:t>
             </w:r>
           </w:p>
         </w:tc>
         <w:tc>
           <w:tcPr>
-            <w:tcW w:type="dxa" w:w="2880"/>
+            <w:tcW w:type="dxa" w:w="3360"/>
+            <w:shd w:val="clear" w:color="auto" w:fill="FFFFFF"/>
           </w:tcPr>
           <w:p>
+            <w:pPr>
+              <w:spacing w:before="40" w:after="40" w:line="240" w:lineRule="auto"/>
+            </w:pPr>
+            <w:r/>
             <w:r>
+              <w:rPr>
+                <w:color w:val="1A1A1A"/>
+                <w:sz w:val="20"/>
+              </w:rPr>
               <w:t>SMB 32TB DevStorage</w:t>
             </w:r>
           </w:p>
         </w:tc>
         <w:tc>
           <w:tcPr>
-            <w:tcW w:type="dxa" w:w="2880"/>
+            <w:tcW w:type="dxa" w:w="3360"/>
+            <w:shd w:val="clear" w:color="auto" w:fill="FFFFFF"/>
           </w:tcPr>
           <w:p>
+            <w:pPr>
+              <w:spacing w:before="40" w:after="40" w:line="240" w:lineRule="auto"/>
+            </w:pPr>
+            <w:r/>
             <w:r>
+              <w:rPr>
+                <w:color w:val="1A1A1A"/>
+                <w:sz w:val="20"/>
+              </w:rPr>
               <w:t>Putting sole source of truth there</w:t>
             </w:r>
           </w:p>
         </w:tc>
       </w:tr>
       <w:tr>
+        <w:trPr>
+          <w:cantSplit/>
+        </w:trPr>
         <w:tc>
           <w:tcPr>
-            <w:tcW w:type="dxa" w:w="2880"/>
+            <w:tcW w:type="dxa" w:w="3360"/>
+            <w:shd w:val="clear" w:color="auto" w:fill="D3DFEE"/>
           </w:tcPr>
           <w:p>
+            <w:pPr>
+              <w:spacing w:before="40" w:after="40" w:line="240" w:lineRule="auto"/>
+            </w:pPr>
+            <w:r/>
             <w:r>
+              <w:rPr>
+                <w:b/>
+                <w:color w:val="173A53"/>
+                <w:sz w:val="20"/>
+              </w:rPr>
               <w:t>Media libraries (ABS, etc.)</w:t>
             </w:r>
           </w:p>
         </w:tc>
         <w:tc>
           <w:tcPr>
-            <w:tcW w:type="dxa" w:w="2880"/>
+            <w:tcW w:type="dxa" w:w="3360"/>
+            <w:shd w:val="clear" w:color="auto" w:fill="D3DFEE"/>
           </w:tcPr>
           <w:p>
+            <w:pPr>
+              <w:spacing w:before="40" w:after="40" w:line="240" w:lineRule="auto"/>
+            </w:pPr>
+            <w:r/>
             <w:r>
+              <w:rPr>
+                <w:color w:val="1A1A1A"/>
+                <w:sz w:val="20"/>
+              </w:rPr>
               <w:t>Existing mini PVC SMB</w:t>
             </w:r>
           </w:p>
         </w:tc>
         <w:tc>
           <w:tcPr>
-            <w:tcW w:type="dxa" w:w="2880"/>
+            <w:tcW w:type="dxa" w:w="3360"/>
+            <w:shd w:val="clear" w:color="auto" w:fill="D3DFEE"/>
           </w:tcPr>
           <w:p>
+            <w:pPr>
+              <w:spacing w:before="40" w:after="40" w:line="240" w:lineRule="auto"/>
+            </w:pPr>
+            <w:r/>
             <w:r>
+              <w:rPr>
+                <w:color w:val="1A1A1A"/>
+                <w:sz w:val="20"/>
+              </w:rPr>
               <w:t>Longhorn for multi-TB libraries</w:t>
             </w:r>
           </w:p>
         </w:tc>
       </w:tr>
       <w:tr>
+        <w:trPr>
+          <w:cantSplit/>
+        </w:trPr>
         <w:tc>
           <w:tcPr>
-            <w:tcW w:type="dxa" w:w="2880"/>
+            <w:tcW w:type="dxa" w:w="3360"/>
+            <w:shd w:val="clear" w:color="auto" w:fill="FFFFFF"/>
           </w:tcPr>
           <w:p>
+            <w:pPr>
+              <w:spacing w:before="40" w:after="40" w:line="240" w:lineRule="auto"/>
+            </w:pPr>
+            <w:r/>
             <w:r>
+              <w:rPr>
+                <w:b/>
+                <w:color w:val="173A53"/>
+                <w:sz w:val="20"/>
+              </w:rPr>
               <w:t>Mealie-style app state</w:t>
             </w:r>
           </w:p>
         </w:tc>
         <w:tc>
           <w:tcPr>
-            <w:tcW w:type="dxa" w:w="2880"/>
+            <w:tcW w:type="dxa" w:w="3360"/>
+            <w:shd w:val="clear" w:color="auto" w:fill="FFFFFF"/>
           </w:tcPr>
           <w:p>
+            <w:pPr>
+              <w:spacing w:before="40" w:after="40" w:line="240" w:lineRule="auto"/>
+            </w:pPr>
+            <w:r/>
             <w:r>
+              <w:rPr>
+                <w:color w:val="1A1A1A"/>
+                <w:sz w:val="20"/>
+              </w:rPr>
               <w:t>Longhorn</w:t>
             </w:r>
           </w:p>
         </w:tc>
         <w:tc>
           <w:tcPr>
-            <w:tcW w:type="dxa" w:w="2880"/>
+            <w:tcW w:type="dxa" w:w="3360"/>
+            <w:shd w:val="clear" w:color="auto" w:fill="FFFFFF"/>
           </w:tcPr>
           <w:p>
+            <w:pPr>
+              <w:spacing w:before="40" w:after="40" w:line="240" w:lineRule="auto"/>
+            </w:pPr>
+            <w:r/>
             <w:r>
+              <w:rPr>
+                <w:color w:val="1A1A1A"/>
+                <w:sz w:val="20"/>
+              </w:rPr>
               <w:t>SMB</w:t>
             </w:r>
           </w:p>
         </w:tc>
       </w:tr>
     </w:tbl>
-    <w:p/>
+    <w:p>
+      <w:pPr>
+        <w:spacing w:after="40" w:line="120" w:lineRule="exact"/>
+      </w:pPr>
+    </w:p>
     <w:p>
       <w:pPr>
         <w:pStyle w:val="Heading1"/>
@@ -886,13 +1356,93 @@
       </w:r>
     </w:p>
     <w:sectPr>
+      <w:headerReference w:type="default" r:id="rId9"/>
+      <w:footerReference w:type="default" r:id="rId10"/>
       <w:pgSz w:w="12240" w:h="15840"/>
-      <w:pgMar w:top="1440" w:right="1800" w:bottom="1440" w:left="1800" w:header="720" w:footer="720" w:gutter="0"/>
+      <w:pgMar w:top="1008" w:right="1080" w:bottom="1008" w:left="1080" w:header="720" w:footer="720" w:gutter="0"/>
       <w:cols w:space="720"/>
       <w:docGrid w:linePitch="360"/>
     </w:sectPr>
   </w:body>
 </w:document>
+</file>
+
+<file path=word/footer1.xml><?xml version="1.0" encoding="utf-8"?>
+<w:ftr xmlns:m="http://schemas.openxmlformats.org/officeDocument/2006/math" xmlns:mc="http://schemas.openxmlformats.org/markup-compatibility/2006" xmlns:mo="http://schemas.microsoft.com/office/mac/office/2008/main" xmlns:mv="urn:schemas-microsoft-com:mac:vml" xmlns:o="urn:schemas-microsoft-com:office:office" xmlns:r="http://schemas.openxmlformats.org/officeDocument/2006/relationships" xmlns:v="urn:schemas-microsoft-com:vml" xmlns:w10="urn:schemas-microsoft-com:office:word" xmlns:w14="http://schemas.microsoft.com/office/word/2010/wordml" xmlns:w="http://schemas.openxmlformats.org/wordprocessingml/2006/main" xmlns:wne="http://schemas.microsoft.com/office/word/2006/wordml" xmlns:wp14="http://schemas.microsoft.com/office/word/2010/wordprocessingDrawing" xmlns:wp="http://schemas.openxmlformats.org/drawingml/2006/wordprocessingDrawing" xmlns:wpc="http://schemas.microsoft.com/office/word/2010/wordprocessingCanvas" xmlns:wpg="http://schemas.microsoft.com/office/word/2010/wordprocessingGroup" xmlns:wpi="http://schemas.microsoft.com/office/word/2010/wordprocessingInk" xmlns:wps="http://schemas.microsoft.com/office/word/2010/wordprocessingShape" mc:Ignorable="w14 wp14">
+  <w:p>
+    <w:pPr>
+      <w:pStyle w:val="Footer"/>
+      <w:tabs>
+        <w:tab w:pos="4680" w:val="clear"/>
+        <w:tab w:pos="9360" w:val="clear"/>
+        <w:tab w:pos="10080" w:val="right"/>
+      </w:tabs>
+    </w:pPr>
+    <w:r/>
+    <w:r>
+      <w:rPr>
+        <w:color w:val="595959"/>
+        <w:sz w:val="18"/>
+      </w:rPr>
+      <w:t>Homelab Local GitHub Mirror and Storage Runbook</w:t>
+      <w:tab/>
+    </w:r>
+    <w:r>
+      <w:rPr>
+        <w:color w:val="595959"/>
+        <w:sz w:val="18"/>
+      </w:rPr>
+      <w:fldChar w:fldCharType="begin"/>
+    </w:r>
+    <w:r>
+      <w:rPr>
+        <w:color w:val="595959"/>
+        <w:sz w:val="18"/>
+      </w:rPr>
+      <w:instrText xml:space="preserve">PAGE</w:instrText>
+    </w:r>
+    <w:r>
+      <w:rPr>
+        <w:color w:val="595959"/>
+        <w:sz w:val="18"/>
+      </w:rPr>
+      <w:fldChar w:fldCharType="separate"/>
+    </w:r>
+    <w:r>
+      <w:rPr>
+        <w:color w:val="595959"/>
+        <w:sz w:val="18"/>
+      </w:rPr>
+      <w:t>1</w:t>
+    </w:r>
+    <w:r>
+      <w:rPr>
+        <w:color w:val="595959"/>
+        <w:sz w:val="18"/>
+      </w:rPr>
+      <w:fldChar w:fldCharType="end"/>
+    </w:r>
+  </w:p>
+</w:ftr>
+</file>
+
+<file path=word/header1.xml><?xml version="1.0" encoding="utf-8"?>
+<w:hdr xmlns:m="http://schemas.openxmlformats.org/officeDocument/2006/math" xmlns:mc="http://schemas.openxmlformats.org/markup-compatibility/2006" xmlns:mo="http://schemas.microsoft.com/office/mac/office/2008/main" xmlns:mv="urn:schemas-microsoft-com:mac:vml" xmlns:o="urn:schemas-microsoft-com:office:office" xmlns:r="http://schemas.openxmlformats.org/officeDocument/2006/relationships" xmlns:v="urn:schemas-microsoft-com:vml" xmlns:w10="urn:schemas-microsoft-com:office:word" xmlns:w14="http://schemas.microsoft.com/office/word/2010/wordml" xmlns:w="http://schemas.openxmlformats.org/wordprocessingml/2006/main" xmlns:wne="http://schemas.microsoft.com/office/word/2006/wordml" xmlns:wp14="http://schemas.microsoft.com/office/word/2010/wordprocessingDrawing" xmlns:wp="http://schemas.openxmlformats.org/drawingml/2006/wordprocessingDrawing" xmlns:wpc="http://schemas.microsoft.com/office/word/2010/wordprocessingCanvas" xmlns:wpg="http://schemas.microsoft.com/office/word/2010/wordprocessingGroup" xmlns:wpi="http://schemas.microsoft.com/office/word/2010/wordprocessingInk" xmlns:wps="http://schemas.microsoft.com/office/word/2010/wordprocessingShape" mc:Ignorable="w14 wp14">
+  <w:p>
+    <w:pPr>
+      <w:pStyle w:val="Header"/>
+    </w:pPr>
+    <w:r/>
+    <w:r>
+      <w:rPr>
+        <w:b/>
+        <w:color w:val="4F81BD"/>
+        <w:sz w:val="18"/>
+      </w:rPr>
+      <w:t>SKYNET HOME LAB   /   LOCAL GITHUB MIRROR</w:t>
+    </w:r>
+  </w:p>
+</w:hdr>
 </file>
 
 <file path=word/numbering.xml><?xml version="1.0" encoding="utf-8"?>
@@ -1258,8 +1808,11 @@
     <w:name w:val="Normal"/>
     <w:qFormat/>
     <w:rsid w:val="00FC693F"/>
+    <w:pPr>
+      <w:spacing w:after="140" w:line="276" w:lineRule="auto"/>
+    </w:pPr>
     <w:rPr>
-      <w:rFonts w:ascii="Calibri" w:hAnsi="Calibri"/>
+      <w:rFonts w:ascii="Calibri" w:hAnsi="Calibri" w:eastAsia="Calibri"/>
       <w:sz w:val="22"/>
     </w:rPr>
   </w:style>
@@ -1318,14 +1871,18 @@
     <w:pPr>
       <w:keepNext/>
       <w:keepLines/>
-      <w:spacing w:before="480" w:after="0"/>
+      <w:pBdr>
+        <w:bottom w:val="single" w:sz="6" w:space="2" w:color="4F81BD"/>
+      </w:pBdr>
+      <w:spacing w:before="320" w:after="120"/>
       <w:outlineLvl w:val="0"/>
     </w:pPr>
     <w:rPr>
-      <w:rFonts w:asciiTheme="majorHAnsi" w:eastAsiaTheme="majorEastAsia" w:hAnsiTheme="majorHAnsi" w:cstheme="majorBidi" w:ascii="Calibri" w:hAnsi="Calibri"/>
+      <w:rFonts w:ascii="Calibri" w:hAnsi="Calibri"/>
       <w:b/>
       <w:bCs/>
-      <w:sz w:val="28"/>
+      <w:color w:val="173A53"/>
+      <w:sz w:val="32"/>
       <w:szCs w:val="28"/>
     </w:rPr>
   </w:style>
@@ -1341,13 +1898,14 @@
     <w:pPr>
       <w:keepNext/>
       <w:keepLines/>
-      <w:spacing w:before="200" w:after="0"/>
+      <w:spacing w:before="240" w:after="60"/>
       <w:outlineLvl w:val="1"/>
     </w:pPr>
     <w:rPr>
-      <w:rFonts w:asciiTheme="majorHAnsi" w:eastAsiaTheme="majorEastAsia" w:hAnsiTheme="majorHAnsi" w:cstheme="majorBidi" w:ascii="Calibri" w:hAnsi="Calibri"/>
+      <w:rFonts w:ascii="Calibri" w:hAnsi="Calibri"/>
       <w:b/>
       <w:bCs/>
+      <w:color w:val="173A53"/>
       <w:sz w:val="26"/>
       <w:szCs w:val="26"/>
     </w:rPr>
@@ -1364,13 +1922,15 @@
     <w:pPr>
       <w:keepNext/>
       <w:keepLines/>
-      <w:spacing w:before="200" w:after="0"/>
+      <w:spacing w:before="200" w:after="40"/>
       <w:outlineLvl w:val="2"/>
     </w:pPr>
     <w:rPr>
-      <w:rFonts w:asciiTheme="majorHAnsi" w:eastAsiaTheme="majorEastAsia" w:hAnsiTheme="majorHAnsi" w:cstheme="majorBidi" w:ascii="Calibri" w:hAnsi="Calibri"/>
+      <w:rFonts w:ascii="Calibri" w:hAnsi="Calibri"/>
       <w:b/>
       <w:bCs/>
+      <w:color w:val="4F81BD"/>
+      <w:sz w:val="22"/>
     </w:rPr>
   </w:style>
   <w:style w:type="paragraph" w:styleId="Heading4">
@@ -1604,12 +2164,12 @@
       <w:pBdr>
         <w:bottom w:val="single" w:sz="8" w:space="4" w:color="4F81BD" w:themeColor="accent1"/>
       </w:pBdr>
-      <w:spacing w:after="300" w:line="240" w:lineRule="auto"/>
+      <w:spacing w:after="240" w:line="240" w:lineRule="auto"/>
       <w:contextualSpacing/>
     </w:pPr>
     <w:rPr>
-      <w:rFonts w:asciiTheme="majorHAnsi" w:eastAsiaTheme="majorEastAsia" w:hAnsiTheme="majorHAnsi" w:cstheme="majorBidi"/>
-      <w:color w:val="17365D" w:themeColor="text2" w:themeShade="BF"/>
+      <w:rFonts w:ascii="Calibri" w:hAnsi="Calibri"/>
+      <w:color w:val="173A53"/>
       <w:spacing w:val="5"/>
       <w:kern w:val="28"/>
       <w:sz w:val="52"/>
@@ -1639,16 +2199,12 @@
     <w:uiPriority w:val="11"/>
     <w:qFormat/>
     <w:rsid w:val="00FC693F"/>
-    <w:pPr>
-      <w:numPr>
-        <w:ilvl w:val="1"/>
-      </w:numPr>
-    </w:pPr>
+    <w:pPr/>
     <w:rPr>
-      <w:rFonts w:asciiTheme="majorHAnsi" w:eastAsiaTheme="majorEastAsia" w:hAnsiTheme="majorHAnsi" w:cstheme="majorBidi"/>
+      <w:rFonts w:ascii="Calibri" w:hAnsi="Calibri"/>
       <w:i/>
       <w:iCs/>
-      <w:color w:val="4F81BD" w:themeColor="accent1"/>
+      <w:color w:val="4F81BD"/>
       <w:spacing w:val="15"/>
       <w:sz w:val="24"/>
       <w:szCs w:val="24"/>

</xml_diff>